<commit_message>
Contract v3 template: number Acceptance clause (29), fix clause font + spacing
The 'Acceptance of terms' heading now joins the numbered clause list
(auto-numbers 29 after 'Employee:'), its paragraph drops to 10pt to match
the body, and a blank line separates the clause from the 'I accept' line.

Co-Authored-By: Claude Opus 4.8 <noreply@anthropic.com>
</commit_message>
<xml_diff>
--- a/doc_templates/template_Employment_Contract_v3.docx
+++ b/doc_templates/template_Employment_Contract_v3.docx
@@ -37059,7 +37059,12 @@
       </w:pPr>
     </w:p>
     <w:p>
-      <w:pPr/>
+      <w:pPr>
+        <w:numPr>
+          <w:ilvl w:val="0"/>
+          <w:numId w:val="5"/>
+        </w:numPr>
+      </w:pPr>
       <w:r>
         <w:rPr>
           <w:b/>
@@ -37070,9 +37075,13 @@
     <w:p>
       <w:pPr/>
       <w:r>
+        <w:rPr>
+          <w:sz w:val="20"/>
+        </w:rPr>
         <w:t>You are asked to sign and return a copy of this contract. However, whether or not you do so, by commencing or continuing your employment with the Employer you will be deemed to have accepted, and agreed to be bound by, the terms and conditions set out in this document.</w:t>
       </w:r>
     </w:p>
+    <w:p/>
     <w:p>
       <w:pPr>
         <w:rPr>

</xml_diff>

<commit_message>
HR docs: entity-aware text letterhead on contract, offer letter + NEN PDF
Adds a compact, centred text letterhead (no logo yet) to the top of the
Employment Contract, Offer Letter (Word templates) and the New Employee
Notification PDF: trading name headline, then legal entity and full address on
one line, with a hairline. It's entity-aware per store, pulling from
company_entities via new merge fields <<company trading name>> / <<company legal
name>> — so a Newbury doc shows MAUKBs Ltd and an Uxbridge doc shows Sappy
Properties (Uxbridge) LLP, each with its own address.

Verified: contract stays 10 pages (the compact 2-line header adds no page break),
letterhead fills correctly, and the entity switches correctly between stores.
Logo can be dropped in above the text later without redoing this.

Co-Authored-By: Claude Opus 4.8 <noreply@anthropic.com>
</commit_message>
<xml_diff>
--- a/doc_templates/template_Employment_Contract_v3.docx
+++ b/doc_templates/template_Employment_Contract_v3.docx
@@ -4,6 +4,8 @@
   <w:body>
     <w:p>
       <w:pPr>
+        <w:spacing w:after="40" w:before="0"/>
+        <w:jc w:val="center"/>
         <w:rPr>
           <w:b/>
           <w:bCs/>
@@ -13,22 +15,37 @@
         <w:rPr>
           <w:b/>
           <w:bCs/>
-        </w:rPr>
-        <w:t>Snappy</w:t>
+          <w:sz w:val="28"/>
+        </w:rPr>
+        <w:t>&lt;&lt;company trading name&gt;&gt;</w:t>
       </w:r>
       <w:r>
         <w:rPr>
           <w:b/>
           <w:bCs/>
         </w:rPr>
-        <w:t xml:space="preserve"> </w:t>
       </w:r>
       <w:r>
         <w:rPr>
           <w:b/>
           <w:bCs/>
         </w:rPr>
-        <w:t>snaps</w:t>
+      </w:r>
+    </w:p>
+    <w:p>
+      <w:pPr>
+        <w:spacing w:after="40" w:before="0"/>
+        <w:jc w:val="center"/>
+        <w:pBdr>
+          <w:bottom w:val="single" w:sz="6" w:space="6" w:color="BBBBBB"/>
+        </w:pBdr>
+      </w:pPr>
+      <w:r>
+        <w:rPr>
+          <w:b w:val="0"/>
+          <w:sz w:val="18"/>
+        </w:rPr>
+        <w:t>&lt;&lt;company legal name&gt;&gt; – &lt;&lt;store address&gt;&gt;</w:t>
       </w:r>
     </w:p>
     <w:p>

</xml_diff>

<commit_message>
Letterhead: entity-aware logo + name/address across HR docs
Contract, Offer Letter and New Employee Notification now carry a
consistent letterhead — the Snappy Snaps logo on the left with four navy
lines beside it (trading name, legal entity, two-line address) and a
hairline underneath. The store's own entity fills in automatically
(Newbury vs Uxbridge).

- Word templates: letterhead built into the page header (repeats every
  page, no impact on body pagination; contract stays 10 pages). Column
  grid set explicitly so the text sits next to the logo.
- fill_word_template now fills header/footer merge fields too, but keeps
  the letterhead's own navy sizing/weights instead of the body's
  bold-every-value house style.
- New Employee Notification PDF: matching logo-left + navy text + hairline.
- Logo shipped as doc_templates/letterhead_logo.jpeg.

Co-Authored-By: Claude Opus 4.8 <noreply@anthropic.com>
</commit_message>
<xml_diff>
--- a/doc_templates/template_Employment_Contract_v3.docx
+++ b/doc_templates/template_Employment_Contract_v3.docx
@@ -2,52 +2,6 @@
 <file path=word/document.xml><?xml version="1.0" encoding="utf-8"?>
 <w:document xmlns:wpc="http://schemas.microsoft.com/office/word/2010/wordprocessingCanvas" xmlns:cx="http://schemas.microsoft.com/office/drawing/2014/chartex" xmlns:cx1="http://schemas.microsoft.com/office/drawing/2015/9/8/chartex" xmlns:cx2="http://schemas.microsoft.com/office/drawing/2015/10/21/chartex" xmlns:cx3="http://schemas.microsoft.com/office/drawing/2016/5/9/chartex" xmlns:cx4="http://schemas.microsoft.com/office/drawing/2016/5/10/chartex" xmlns:cx5="http://schemas.microsoft.com/office/drawing/2016/5/11/chartex" xmlns:cx6="http://schemas.microsoft.com/office/drawing/2016/5/12/chartex" xmlns:cx7="http://schemas.microsoft.com/office/drawing/2016/5/13/chartex" xmlns:cx8="http://schemas.microsoft.com/office/drawing/2016/5/14/chartex" xmlns:mc="http://schemas.openxmlformats.org/markup-compatibility/2006" xmlns:aink="http://schemas.microsoft.com/office/drawing/2016/ink" xmlns:am3d="http://schemas.microsoft.com/office/drawing/2017/model3d" xmlns:o="urn:schemas-microsoft-com:office:office" xmlns:oel="http://schemas.microsoft.com/office/2019/extlst" xmlns:r="http://schemas.openxmlformats.org/officeDocument/2006/relationships" xmlns:m="http://schemas.openxmlformats.org/officeDocument/2006/math" xmlns:v="urn:schemas-microsoft-com:vml" xmlns:wp14="http://schemas.microsoft.com/office/word/2010/wordprocessingDrawing" xmlns:wp="http://schemas.openxmlformats.org/drawingml/2006/wordprocessingDrawing" xmlns:w10="urn:schemas-microsoft-com:office:word" xmlns:w="http://schemas.openxmlformats.org/wordprocessingml/2006/main" xmlns:w14="http://schemas.microsoft.com/office/word/2010/wordml" xmlns:w15="http://schemas.microsoft.com/office/word/2012/wordml" xmlns:w16cex="http://schemas.microsoft.com/office/word/2018/wordml/cex" xmlns:w16cid="http://schemas.microsoft.com/office/word/2016/wordml/cid" xmlns:w16="http://schemas.microsoft.com/office/word/2018/wordml" xmlns:w16du="http://schemas.microsoft.com/office/word/2023/wordml/word16du" xmlns:w16sdtdh="http://schemas.microsoft.com/office/word/2020/wordml/sdtdatahash" xmlns:w16sdtfl="http://schemas.microsoft.com/office/word/2024/wordml/sdtformatlock" xmlns:w16se="http://schemas.microsoft.com/office/word/2015/wordml/symex" xmlns:wpg="http://schemas.microsoft.com/office/word/2010/wordprocessingGroup" xmlns:wpi="http://schemas.microsoft.com/office/word/2010/wordprocessingInk" xmlns:wne="http://schemas.microsoft.com/office/word/2006/wordml" xmlns:wps="http://schemas.microsoft.com/office/word/2010/wordprocessingShape" mc:Ignorable="w14 w15 w16se w16cid w16 w16cex w16sdtdh w16sdtfl w16du wp14">
   <w:body>
-    <w:p>
-      <w:pPr>
-        <w:spacing w:after="40" w:before="0"/>
-        <w:jc w:val="center"/>
-        <w:rPr>
-          <w:b/>
-          <w:bCs/>
-        </w:rPr>
-      </w:pPr>
-      <w:r>
-        <w:rPr>
-          <w:b/>
-          <w:bCs/>
-          <w:sz w:val="28"/>
-        </w:rPr>
-        <w:t>&lt;&lt;company trading name&gt;&gt;</w:t>
-      </w:r>
-      <w:r>
-        <w:rPr>
-          <w:b/>
-          <w:bCs/>
-        </w:rPr>
-      </w:r>
-      <w:r>
-        <w:rPr>
-          <w:b/>
-          <w:bCs/>
-        </w:rPr>
-      </w:r>
-    </w:p>
-    <w:p>
-      <w:pPr>
-        <w:spacing w:after="40" w:before="0"/>
-        <w:jc w:val="center"/>
-        <w:pBdr>
-          <w:bottom w:val="single" w:sz="6" w:space="6" w:color="BBBBBB"/>
-        </w:pBdr>
-      </w:pPr>
-      <w:r>
-        <w:rPr>
-          <w:b w:val="0"/>
-          <w:sz w:val="18"/>
-        </w:rPr>
-        <w:t>&lt;&lt;company legal name&gt;&gt; – &lt;&lt;store address&gt;&gt;</w:t>
-      </w:r>
-    </w:p>
     <w:p>
       <w:pPr>
         <w:rPr>
@@ -54184,231 +54138,153 @@
 
 <file path=word/header1.xml><?xml version="1.0" encoding="utf-8"?>
 <w:hdr xmlns:wpc="http://schemas.microsoft.com/office/word/2010/wordprocessingCanvas" xmlns:cx="http://schemas.microsoft.com/office/drawing/2014/chartex" xmlns:cx1="http://schemas.microsoft.com/office/drawing/2015/9/8/chartex" xmlns:cx2="http://schemas.microsoft.com/office/drawing/2015/10/21/chartex" xmlns:cx3="http://schemas.microsoft.com/office/drawing/2016/5/9/chartex" xmlns:cx4="http://schemas.microsoft.com/office/drawing/2016/5/10/chartex" xmlns:cx5="http://schemas.microsoft.com/office/drawing/2016/5/11/chartex" xmlns:cx6="http://schemas.microsoft.com/office/drawing/2016/5/12/chartex" xmlns:cx7="http://schemas.microsoft.com/office/drawing/2016/5/13/chartex" xmlns:cx8="http://schemas.microsoft.com/office/drawing/2016/5/14/chartex" xmlns:mc="http://schemas.openxmlformats.org/markup-compatibility/2006" xmlns:aink="http://schemas.microsoft.com/office/drawing/2016/ink" xmlns:am3d="http://schemas.microsoft.com/office/drawing/2017/model3d" xmlns:o="urn:schemas-microsoft-com:office:office" xmlns:oel="http://schemas.microsoft.com/office/2019/extlst" xmlns:r="http://schemas.openxmlformats.org/officeDocument/2006/relationships" xmlns:m="http://schemas.openxmlformats.org/officeDocument/2006/math" xmlns:v="urn:schemas-microsoft-com:vml" xmlns:wp14="http://schemas.microsoft.com/office/word/2010/wordprocessingDrawing" xmlns:wp="http://schemas.openxmlformats.org/drawingml/2006/wordprocessingDrawing" xmlns:w10="urn:schemas-microsoft-com:office:word" xmlns:w="http://schemas.openxmlformats.org/wordprocessingml/2006/main" xmlns:w14="http://schemas.microsoft.com/office/word/2010/wordml" xmlns:w15="http://schemas.microsoft.com/office/word/2012/wordml" xmlns:w16cex="http://schemas.microsoft.com/office/word/2018/wordml/cex" xmlns:w16cid="http://schemas.microsoft.com/office/word/2016/wordml/cid" xmlns:w16="http://schemas.microsoft.com/office/word/2018/wordml" xmlns:w16du="http://schemas.microsoft.com/office/word/2023/wordml/word16du" xmlns:w16sdtdh="http://schemas.microsoft.com/office/word/2020/wordml/sdtdatahash" xmlns:w16sdtfl="http://schemas.microsoft.com/office/word/2024/wordml/sdtformatlock" xmlns:w16se="http://schemas.microsoft.com/office/word/2015/wordml/symex" xmlns:wpg="http://schemas.microsoft.com/office/word/2010/wordprocessingGroup" xmlns:wpi="http://schemas.microsoft.com/office/word/2010/wordprocessingInk" xmlns:wne="http://schemas.microsoft.com/office/word/2006/wordml" xmlns:wps="http://schemas.microsoft.com/office/word/2010/wordprocessingShape" mc:Ignorable="w14 w15 w16se w16cid w16 w16cex w16sdtdh w16sdtfl w16du wp14">
+  <w:tbl>
+    <w:tblPr>
+      <w:tblW w:type="auto" w:w="0"/>
+      <w:tblLayout w:type="fixed"/>
+      <w:tblLook w:firstColumn="1" w:firstRow="1" w:lastColumn="0" w:lastRow="0" w:noHBand="0" w:noVBand="1" w:val="04A0"/>
+      <w:tblCellMar>
+        <w:top w:w="0" w:type="dxa"/>
+        <w:bottom w:w="0" w:type="dxa"/>
+        <w:left w:w="0" w:type="dxa"/>
+        <w:right w:w="40" w:type="dxa"/>
+      </w:tblCellMar>
+      <w:tblBorders>
+        <w:bottom w:val="single" w:sz="6" w:space="0" w:color="1e3a5f"/>
+        <w:top w:val="none"/>
+        <w:left w:val="none"/>
+        <w:right w:val="none"/>
+        <w:insideH w:val="none"/>
+        <w:insideV w:val="none"/>
+      </w:tblBorders>
+    </w:tblPr>
+    <w:tblGrid>
+      <w:gridCol w:w="2494"/>
+      <w:gridCol w:w="7999"/>
+    </w:tblGrid>
+    <w:tr>
+      <w:tc>
+        <w:tcPr>
+          <w:tcW w:type="dxa" w:w="2494"/>
+          <w:vAlign w:val="center"/>
+        </w:tcPr>
+        <w:p>
+          <w:pPr>
+            <w:spacing w:after="0"/>
+            <w:jc w:val="left"/>
+          </w:pPr>
+          <w:r>
+            <w:drawing>
+              <wp:inline xmlns:a="http://schemas.openxmlformats.org/drawingml/2006/main" xmlns:pic="http://schemas.openxmlformats.org/drawingml/2006/picture">
+                <wp:extent cx="1368000" cy="669049"/>
+                <wp:docPr id="1" name="Picture 1"/>
+                <wp:cNvGraphicFramePr>
+                  <a:graphicFrameLocks noChangeAspect="1"/>
+                </wp:cNvGraphicFramePr>
+                <a:graphic>
+                  <a:graphicData uri="http://schemas.openxmlformats.org/drawingml/2006/picture">
+                    <pic:pic>
+                      <pic:nvPicPr>
+                        <pic:cNvPr id="0" name="image.jpg"/>
+                        <pic:cNvPicPr/>
+                      </pic:nvPicPr>
+                      <pic:blipFill>
+                        <a:blip r:embed="rId2"/>
+                        <a:stretch>
+                          <a:fillRect/>
+                        </a:stretch>
+                      </pic:blipFill>
+                      <pic:spPr>
+                        <a:xfrm>
+                          <a:off x="0" y="0"/>
+                          <a:ext cx="1368000" cy="669049"/>
+                        </a:xfrm>
+                        <a:prstGeom prst="rect"/>
+                      </pic:spPr>
+                    </pic:pic>
+                  </a:graphicData>
+                </a:graphic>
+              </wp:inline>
+            </w:drawing>
+          </w:r>
+        </w:p>
+      </w:tc>
+      <w:tc>
+        <w:tcPr>
+          <w:tcW w:type="dxa" w:w="7999"/>
+          <w:vAlign w:val="center"/>
+        </w:tcPr>
+        <w:p>
+          <w:pPr>
+            <w:spacing w:before="0" w:after="20" w:line="240" w:lineRule="auto"/>
+            <w:jc w:val="left"/>
+          </w:pPr>
+          <w:r>
+            <w:rPr>
+              <w:rFonts w:ascii="Arial" w:hAnsi="Arial"/>
+              <w:b/>
+              <w:color w:val="1E3A5F"/>
+              <w:sz w:val="28"/>
+            </w:rPr>
+            <w:t>&lt;&lt;company trading name&gt;&gt;</w:t>
+          </w:r>
+        </w:p>
+        <w:p>
+          <w:pPr>
+            <w:spacing w:before="0" w:after="20" w:line="240" w:lineRule="auto"/>
+            <w:jc w:val="left"/>
+          </w:pPr>
+          <w:r>
+            <w:rPr>
+              <w:rFonts w:ascii="Arial" w:hAnsi="Arial"/>
+              <w:b w:val="0"/>
+              <w:color w:val="1E3A5F"/>
+              <w:sz w:val="18"/>
+            </w:rPr>
+            <w:t>&lt;&lt;company legal name&gt;&gt;</w:t>
+          </w:r>
+        </w:p>
+        <w:p>
+          <w:pPr>
+            <w:spacing w:before="0" w:after="20" w:line="240" w:lineRule="auto"/>
+            <w:jc w:val="left"/>
+          </w:pPr>
+          <w:r>
+            <w:rPr>
+              <w:rFonts w:ascii="Arial" w:hAnsi="Arial"/>
+              <w:b w:val="0"/>
+              <w:color w:val="1E3A5F"/>
+              <w:sz w:val="18"/>
+            </w:rPr>
+            <w:t>&lt;&lt;store address line 1&gt;&gt;, &lt;&lt;store address line 2&gt;&gt;</w:t>
+          </w:r>
+        </w:p>
+        <w:p>
+          <w:pPr>
+            <w:spacing w:before="0" w:after="20" w:line="240" w:lineRule="auto"/>
+            <w:jc w:val="left"/>
+          </w:pPr>
+          <w:r>
+            <w:rPr>
+              <w:rFonts w:ascii="Arial" w:hAnsi="Arial"/>
+              <w:b w:val="0"/>
+              <w:color w:val="1E3A5F"/>
+              <w:sz w:val="18"/>
+            </w:rPr>
+            <w:t>&lt;&lt;store address line 3&gt;&gt;, &lt;&lt;store address line 4&gt;&gt;</w:t>
+          </w:r>
+        </w:p>
+      </w:tc>
+    </w:tr>
+  </w:tbl>
   <w:p>
     <w:pPr>
-      <w:pStyle w:val="BodyText"/>
-      <w:kinsoku w:val="0"/>
-      <w:overflowPunct w:val="0"/>
-      <w:spacing w:line="14" w:lineRule="auto"/>
-      <w:ind w:left="0" w:firstLine="0"/>
+      <w:spacing w:before="0" w:after="0"/>
     </w:pPr>
     <w:r>
       <w:rPr>
-        <w:noProof/>
+        <w:sz w:val="2"/>
       </w:rPr>
-      <mc:AlternateContent>
-        <mc:Choice Requires="wps">
-          <w:drawing>
-            <wp:anchor distT="0" distB="0" distL="114300" distR="114300" simplePos="0" relativeHeight="251659264" behindDoc="1" locked="0" layoutInCell="0" allowOverlap="1" wp14:anchorId="13047D35" wp14:editId="2E441AB2">
-              <wp:simplePos x="0" y="0"/>
-              <wp:positionH relativeFrom="page">
-                <wp:posOffset>3032760</wp:posOffset>
-              </wp:positionH>
-              <wp:positionV relativeFrom="page">
-                <wp:posOffset>179705</wp:posOffset>
-              </wp:positionV>
-              <wp:extent cx="1676400" cy="825500"/>
-              <wp:effectExtent l="0" t="0" r="0" b="0"/>
-              <wp:wrapNone/>
-              <wp:docPr id="90035676" name="Rectangle 1"/>
-              <wp:cNvGraphicFramePr>
-                <a:graphicFrameLocks xmlns:a="http://schemas.openxmlformats.org/drawingml/2006/main"/>
-              </wp:cNvGraphicFramePr>
-              <a:graphic xmlns:a="http://schemas.openxmlformats.org/drawingml/2006/main">
-                <a:graphicData uri="http://schemas.microsoft.com/office/word/2010/wordprocessingShape">
-                  <wps:wsp>
-                    <wps:cNvSpPr>
-                      <a:spLocks noChangeArrowheads="1"/>
-                    </wps:cNvSpPr>
-                    <wps:spPr bwMode="auto">
-                      <a:xfrm>
-                        <a:off x="0" y="0"/>
-                        <a:ext cx="1676400" cy="825500"/>
-                      </a:xfrm>
-                      <a:prstGeom prst="rect">
-                        <a:avLst/>
-                      </a:prstGeom>
-                      <a:noFill/>
-                      <a:ln>
-                        <a:noFill/>
-                      </a:ln>
-                      <a:extLst>
-                        <a:ext uri="{909E8E84-426E-40DD-AFC4-6F175D3DCCD1}">
-                          <a14:hiddenFill xmlns:a14="http://schemas.microsoft.com/office/drawing/2010/main">
-                            <a:solidFill>
-                              <a:srgbClr val="FFFFFF"/>
-                            </a:solidFill>
-                          </a14:hiddenFill>
-                        </a:ext>
-                        <a:ext uri="{91240B29-F687-4F45-9708-019B960494DF}">
-                          <a14:hiddenLine xmlns:a14="http://schemas.microsoft.com/office/drawing/2010/main" w="9525">
-                            <a:solidFill>
-                              <a:srgbClr val="000000"/>
-                            </a:solidFill>
-                            <a:miter lim="800000"/>
-                            <a:headEnd/>
-                            <a:tailEnd/>
-                          </a14:hiddenLine>
-                        </a:ext>
-                      </a:extLst>
-                    </wps:spPr>
-                    <wps:txbx>
-                      <w:txbxContent>
-                        <w:p>
-                          <w:pPr>
-                            <w:widowControl/>
-                            <w:autoSpaceDE/>
-                            <w:autoSpaceDN/>
-                            <w:adjustRightInd/>
-                            <w:spacing w:line="1300" w:lineRule="atLeast"/>
-                          </w:pPr>
-                          <w:r>
-                            <w:rPr>
-                              <w:noProof/>
-                            </w:rPr>
-                            <w:drawing>
-                              <wp:inline distT="0" distB="0" distL="0" distR="0" wp14:anchorId="4D26D2EC" wp14:editId="657693EE">
-                                <wp:extent cx="1670685" cy="814705"/>
-                                <wp:effectExtent l="0" t="0" r="0" b="0"/>
-                                <wp:docPr id="3" name="Picture 1"/>
-                                <wp:cNvGraphicFramePr>
-                                  <a:graphicFrameLocks xmlns:a="http://schemas.openxmlformats.org/drawingml/2006/main" noChangeAspect="1"/>
-                                </wp:cNvGraphicFramePr>
-                                <a:graphic xmlns:a="http://schemas.openxmlformats.org/drawingml/2006/main">
-                                  <a:graphicData uri="http://schemas.openxmlformats.org/drawingml/2006/picture">
-                                    <pic:pic xmlns:pic="http://schemas.openxmlformats.org/drawingml/2006/picture">
-                                      <pic:nvPicPr>
-                                        <pic:cNvPr id="0" name="Picture 3"/>
-                                        <pic:cNvPicPr>
-                                          <a:picLocks noChangeAspect="1" noChangeArrowheads="1"/>
-                                        </pic:cNvPicPr>
-                                      </pic:nvPicPr>
-                                      <pic:blipFill>
-                                        <a:blip r:embed="rId1">
-                                          <a:extLst>
-                                            <a:ext uri="{28A0092B-C50C-407E-A947-70E740481C1C}">
-                                              <a14:useLocalDpi xmlns:a14="http://schemas.microsoft.com/office/drawing/2010/main" val="0"/>
-                                            </a:ext>
-                                          </a:extLst>
-                                        </a:blip>
-                                        <a:srcRect/>
-                                        <a:stretch>
-                                          <a:fillRect/>
-                                        </a:stretch>
-                                      </pic:blipFill>
-                                      <pic:spPr bwMode="auto">
-                                        <a:xfrm>
-                                          <a:off x="0" y="0"/>
-                                          <a:ext cx="1670685" cy="814705"/>
-                                        </a:xfrm>
-                                        <a:prstGeom prst="rect">
-                                          <a:avLst/>
-                                        </a:prstGeom>
-                                        <a:noFill/>
-                                        <a:ln>
-                                          <a:noFill/>
-                                        </a:ln>
-                                      </pic:spPr>
-                                    </pic:pic>
-                                  </a:graphicData>
-                                </a:graphic>
-                              </wp:inline>
-                            </w:drawing>
-                          </w:r>
-                        </w:p>
-                        <w:p/>
-                      </w:txbxContent>
-                    </wps:txbx>
-                    <wps:bodyPr rot="0" vert="horz" wrap="square" lIns="0" tIns="0" rIns="0" bIns="0" anchor="t" anchorCtr="0" upright="1">
-                      <a:noAutofit/>
-                    </wps:bodyPr>
-                  </wps:wsp>
-                </a:graphicData>
-              </a:graphic>
-              <wp14:sizeRelH relativeFrom="page">
-                <wp14:pctWidth>0</wp14:pctWidth>
-              </wp14:sizeRelH>
-              <wp14:sizeRelV relativeFrom="page">
-                <wp14:pctHeight>0</wp14:pctHeight>
-              </wp14:sizeRelV>
-            </wp:anchor>
-          </w:drawing>
-        </mc:Choice>
-        <mc:Fallback>
-          <w:pict>
-            <v:rect w14:anchorId="13047D35" id="Rectangle 1" o:spid="_x0000_s1026" style="position:absolute;margin-left:238.8pt;margin-top:14.15pt;width:132pt;height:65pt;z-index:-251657216;visibility:visible;mso-wrap-style:square;mso-width-percent:0;mso-height-percent:0;mso-wrap-distance-left:9pt;mso-wrap-distance-top:0;mso-wrap-distance-right:9pt;mso-wrap-distance-bottom:0;mso-position-horizontal:absolute;mso-position-horizontal-relative:page;mso-position-vertical:absolute;mso-position-vertical-relative:page;mso-width-percent:0;mso-height-percent:0;mso-width-relative:page;mso-height-relative:page;v-text-anchor:top" o:gfxdata="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" o:allowincell="f" filled="f" stroked="f">
-              <v:textbox inset="0,0,0,0">
-                <w:txbxContent>
-                  <w:p>
-                    <w:pPr>
-                      <w:widowControl/>
-                      <w:autoSpaceDE/>
-                      <w:autoSpaceDN/>
-                      <w:adjustRightInd/>
-                      <w:spacing w:line="1300" w:lineRule="atLeast"/>
-                    </w:pPr>
-                    <w:r>
-                      <w:rPr>
-                        <w:noProof/>
-                      </w:rPr>
-                      <w:drawing>
-                        <wp:inline distT="0" distB="0" distL="0" distR="0" wp14:anchorId="4D26D2EC" wp14:editId="657693EE">
-                          <wp:extent cx="1670685" cy="814705"/>
-                          <wp:effectExtent l="0" t="0" r="0" b="0"/>
-                          <wp:docPr id="3" name="Picture 1"/>
-                          <wp:cNvGraphicFramePr>
-                            <a:graphicFrameLocks xmlns:a="http://schemas.openxmlformats.org/drawingml/2006/main" noChangeAspect="1"/>
-                          </wp:cNvGraphicFramePr>
-                          <a:graphic xmlns:a="http://schemas.openxmlformats.org/drawingml/2006/main">
-                            <a:graphicData uri="http://schemas.openxmlformats.org/drawingml/2006/picture">
-                              <pic:pic xmlns:pic="http://schemas.openxmlformats.org/drawingml/2006/picture">
-                                <pic:nvPicPr>
-                                  <pic:cNvPr id="0" name="Picture 3"/>
-                                  <pic:cNvPicPr>
-                                    <a:picLocks noChangeAspect="1" noChangeArrowheads="1"/>
-                                  </pic:cNvPicPr>
-                                </pic:nvPicPr>
-                                <pic:blipFill>
-                                  <a:blip r:embed="rId2">
-                                    <a:extLst>
-                                      <a:ext uri="{28A0092B-C50C-407E-A947-70E740481C1C}">
-                                        <a14:useLocalDpi xmlns:a14="http://schemas.microsoft.com/office/drawing/2010/main" val="0"/>
-                                      </a:ext>
-                                    </a:extLst>
-                                  </a:blip>
-                                  <a:srcRect/>
-                                  <a:stretch>
-                                    <a:fillRect/>
-                                  </a:stretch>
-                                </pic:blipFill>
-                                <pic:spPr bwMode="auto">
-                                  <a:xfrm>
-                                    <a:off x="0" y="0"/>
-                                    <a:ext cx="1670685" cy="814705"/>
-                                  </a:xfrm>
-                                  <a:prstGeom prst="rect">
-                                    <a:avLst/>
-                                  </a:prstGeom>
-                                  <a:noFill/>
-                                  <a:ln>
-                                    <a:noFill/>
-                                  </a:ln>
-                                </pic:spPr>
-                              </pic:pic>
-                            </a:graphicData>
-                          </a:graphic>
-                        </wp:inline>
-                      </w:drawing>
-                    </w:r>
-                  </w:p>
-                  <w:p/>
-                </w:txbxContent>
-              </v:textbox>
-              <w10:wrap anchorx="page" anchory="page"/>
-            </v:rect>
-          </w:pict>
-        </mc:Fallback>
-      </mc:AlternateContent>
     </w:r>
   </w:p>
 </w:hdr>

</xml_diff>